<commit_message>
2.7: Bilgi Kosesi 2.2'deki kart oyunu Sira Sizde 2.7'ye 7. soru olarak tasindi, cevabi anahtara eklendi; sonraki Bilgi Kosesi numaralari (2.11, 2.13, 2.14) birer kaydirildi
</commit_message>
<xml_diff>
--- a/CevapAnahtari/Kimya11-tema-2-cevaplar.docx
+++ b/CevapAnahtari/Kimya11-tema-2-cevaplar.docx
@@ -10533,6 +10533,331 @@
           <w:lang w:val="tr-TR"/>
         </w:rPr>
         <w:t xml:space="preserve">O, MgO; nötr oksit: CO, NO</w:t>
+      </w:r>
+    </w:p>
+    <w:p>
+      <w:pPr>
+        <w:jc w:val="both"/>
+        <w:rPr>
+          <w:rFonts w:ascii="Times New Roman" w:hAnsi="Times New Roman" w:cs="Times New Roman"/>
+          <w:lang w:val="tr-TR"/>
+        </w:rPr>
+      </w:pPr>
+      <w:r>
+        <w:rPr>
+          <w:rFonts w:ascii="Times New Roman" w:hAnsi="Times New Roman" w:cs="Times New Roman"/>
+          <w:lang w:val="tr-TR"/>
+        </w:rPr>
+        <w:t xml:space="preserve">7. Örnek kart içerikleri: HCl: Arrhenius asidi ve Brønsted-Lowry asidi, eşlenik bazı Cl</w:t>
+      </w:r>
+      <w:r>
+        <w:rPr>
+          <w:rFonts w:ascii="Times New Roman" w:hAnsi="Times New Roman" w:cs="Times New Roman"/>
+          <w:lang w:val="tr-TR"/>
+          <w:vertAlign w:val="superscript"/>
+        </w:rPr>
+        <w:t xml:space="preserve">−</w:t>
+      </w:r>
+      <w:r>
+        <w:rPr>
+          <w:rFonts w:ascii="Times New Roman" w:hAnsi="Times New Roman" w:cs="Times New Roman"/>
+          <w:lang w:val="tr-TR"/>
+        </w:rPr>
+        <w:t xml:space="preserve">. NH</w:t>
+      </w:r>
+      <w:r>
+        <w:rPr>
+          <w:rFonts w:ascii="Times New Roman" w:hAnsi="Times New Roman" w:cs="Times New Roman"/>
+          <w:lang w:val="tr-TR"/>
+          <w:vertAlign w:val="subscript"/>
+        </w:rPr>
+        <w:t xml:space="preserve">3</w:t>
+      </w:r>
+      <w:r>
+        <w:rPr>
+          <w:rFonts w:ascii="Times New Roman" w:hAnsi="Times New Roman" w:cs="Times New Roman"/>
+          <w:lang w:val="tr-TR"/>
+        </w:rPr>
+        <w:t xml:space="preserve">: yapısında OH</w:t>
+      </w:r>
+      <w:r>
+        <w:rPr>
+          <w:rFonts w:ascii="Times New Roman" w:hAnsi="Times New Roman" w:cs="Times New Roman"/>
+          <w:lang w:val="tr-TR"/>
+          <w:vertAlign w:val="superscript"/>
+        </w:rPr>
+        <w:t xml:space="preserve">−</w:t>
+      </w:r>
+      <w:r>
+        <w:rPr>
+          <w:rFonts w:ascii="Times New Roman" w:hAnsi="Times New Roman" w:cs="Times New Roman"/>
+          <w:lang w:val="tr-TR"/>
+        </w:rPr>
+        <w:t xml:space="preserve"> bulunmadığından bazlığı Arrhenius teorisiyle açıklanamaz; Brønsted-Lowry bazı, eşlenik asidi NH</w:t>
+      </w:r>
+      <w:r>
+        <w:rPr>
+          <w:rFonts w:ascii="Times New Roman" w:hAnsi="Times New Roman" w:cs="Times New Roman"/>
+          <w:lang w:val="tr-TR"/>
+          <w:vertAlign w:val="subscript"/>
+        </w:rPr>
+        <w:t xml:space="preserve">4</w:t>
+      </w:r>
+      <w:r>
+        <w:rPr>
+          <w:rFonts w:ascii="Times New Roman" w:hAnsi="Times New Roman" w:cs="Times New Roman"/>
+          <w:lang w:val="tr-TR"/>
+          <w:vertAlign w:val="superscript"/>
+        </w:rPr>
+        <w:t xml:space="preserve">+</w:t>
+      </w:r>
+      <w:r>
+        <w:rPr>
+          <w:rFonts w:ascii="Times New Roman" w:hAnsi="Times New Roman" w:cs="Times New Roman"/>
+          <w:lang w:val="tr-TR"/>
+        </w:rPr>
+        <w:t xml:space="preserve">. H</w:t>
+      </w:r>
+      <w:r>
+        <w:rPr>
+          <w:rFonts w:ascii="Times New Roman" w:hAnsi="Times New Roman" w:cs="Times New Roman"/>
+          <w:lang w:val="tr-TR"/>
+          <w:vertAlign w:val="subscript"/>
+        </w:rPr>
+        <w:t xml:space="preserve">2</w:t>
+      </w:r>
+      <w:r>
+        <w:rPr>
+          <w:rFonts w:ascii="Times New Roman" w:hAnsi="Times New Roman" w:cs="Times New Roman"/>
+          <w:lang w:val="tr-TR"/>
+        </w:rPr>
+        <w:t xml:space="preserve">O: Brønsted-Lowry teorisine göre amfoter, eşlenik asidi H</w:t>
+      </w:r>
+      <w:r>
+        <w:rPr>
+          <w:rFonts w:ascii="Times New Roman" w:hAnsi="Times New Roman" w:cs="Times New Roman"/>
+          <w:lang w:val="tr-TR"/>
+          <w:vertAlign w:val="subscript"/>
+        </w:rPr>
+        <w:t xml:space="preserve">3</w:t>
+      </w:r>
+      <w:r>
+        <w:rPr>
+          <w:rFonts w:ascii="Times New Roman" w:hAnsi="Times New Roman" w:cs="Times New Roman"/>
+          <w:lang w:val="tr-TR"/>
+        </w:rPr>
+        <w:t xml:space="preserve">O</w:t>
+      </w:r>
+      <w:r>
+        <w:rPr>
+          <w:rFonts w:ascii="Times New Roman" w:hAnsi="Times New Roman" w:cs="Times New Roman"/>
+          <w:lang w:val="tr-TR"/>
+          <w:vertAlign w:val="superscript"/>
+        </w:rPr>
+        <w:t xml:space="preserve">+</w:t>
+      </w:r>
+      <w:r>
+        <w:rPr>
+          <w:rFonts w:ascii="Times New Roman" w:hAnsi="Times New Roman" w:cs="Times New Roman"/>
+          <w:lang w:val="tr-TR"/>
+        </w:rPr>
+        <w:t xml:space="preserve">, eşlenik bazı OH</w:t>
+      </w:r>
+      <w:r>
+        <w:rPr>
+          <w:rFonts w:ascii="Times New Roman" w:hAnsi="Times New Roman" w:cs="Times New Roman"/>
+          <w:lang w:val="tr-TR"/>
+          <w:vertAlign w:val="superscript"/>
+        </w:rPr>
+        <w:t xml:space="preserve">−</w:t>
+      </w:r>
+      <w:r>
+        <w:rPr>
+          <w:rFonts w:ascii="Times New Roman" w:hAnsi="Times New Roman" w:cs="Times New Roman"/>
+          <w:lang w:val="tr-TR"/>
+        </w:rPr>
+        <w:t xml:space="preserve">. HSO</w:t>
+      </w:r>
+      <w:r>
+        <w:rPr>
+          <w:rFonts w:ascii="Times New Roman" w:hAnsi="Times New Roman" w:cs="Times New Roman"/>
+          <w:lang w:val="tr-TR"/>
+          <w:vertAlign w:val="subscript"/>
+        </w:rPr>
+        <w:t xml:space="preserve">4</w:t>
+      </w:r>
+      <w:r>
+        <w:rPr>
+          <w:rFonts w:ascii="Times New Roman" w:hAnsi="Times New Roman" w:cs="Times New Roman"/>
+          <w:lang w:val="tr-TR"/>
+          <w:vertAlign w:val="superscript"/>
+        </w:rPr>
+        <w:t xml:space="preserve">−</w:t>
+      </w:r>
+      <w:r>
+        <w:rPr>
+          <w:rFonts w:ascii="Times New Roman" w:hAnsi="Times New Roman" w:cs="Times New Roman"/>
+          <w:lang w:val="tr-TR"/>
+        </w:rPr>
+        <w:t xml:space="preserve">: suda H</w:t>
+      </w:r>
+      <w:r>
+        <w:rPr>
+          <w:rFonts w:ascii="Times New Roman" w:hAnsi="Times New Roman" w:cs="Times New Roman"/>
+          <w:lang w:val="tr-TR"/>
+          <w:vertAlign w:val="subscript"/>
+        </w:rPr>
+        <w:t xml:space="preserve">3</w:t>
+      </w:r>
+      <w:r>
+        <w:rPr>
+          <w:rFonts w:ascii="Times New Roman" w:hAnsi="Times New Roman" w:cs="Times New Roman"/>
+          <w:lang w:val="tr-TR"/>
+        </w:rPr>
+        <w:t xml:space="preserve">O</w:t>
+      </w:r>
+      <w:r>
+        <w:rPr>
+          <w:rFonts w:ascii="Times New Roman" w:hAnsi="Times New Roman" w:cs="Times New Roman"/>
+          <w:lang w:val="tr-TR"/>
+          <w:vertAlign w:val="superscript"/>
+        </w:rPr>
+        <w:t xml:space="preserve">+</w:t>
+      </w:r>
+      <w:r>
+        <w:rPr>
+          <w:rFonts w:ascii="Times New Roman" w:hAnsi="Times New Roman" w:cs="Times New Roman"/>
+          <w:lang w:val="tr-TR"/>
+        </w:rPr>
+        <w:t xml:space="preserve"> oluşturduğundan Arrhenius asidi; Brønsted-Lowry teorisine göre amfoter, eşlenik bazı SO</w:t>
+      </w:r>
+      <w:r>
+        <w:rPr>
+          <w:rFonts w:ascii="Times New Roman" w:hAnsi="Times New Roman" w:cs="Times New Roman"/>
+          <w:lang w:val="tr-TR"/>
+          <w:vertAlign w:val="subscript"/>
+        </w:rPr>
+        <w:t xml:space="preserve">4</w:t>
+      </w:r>
+      <w:r>
+        <w:rPr>
+          <w:rFonts w:ascii="Times New Roman" w:hAnsi="Times New Roman" w:cs="Times New Roman"/>
+          <w:lang w:val="tr-TR"/>
+          <w:vertAlign w:val="superscript"/>
+        </w:rPr>
+        <w:t xml:space="preserve">2−</w:t>
+      </w:r>
+      <w:r>
+        <w:rPr>
+          <w:rFonts w:ascii="Times New Roman" w:hAnsi="Times New Roman" w:cs="Times New Roman"/>
+          <w:lang w:val="tr-TR"/>
+        </w:rPr>
+        <w:t xml:space="preserve">, eşlenik asidi H</w:t>
+      </w:r>
+      <w:r>
+        <w:rPr>
+          <w:rFonts w:ascii="Times New Roman" w:hAnsi="Times New Roman" w:cs="Times New Roman"/>
+          <w:lang w:val="tr-TR"/>
+          <w:vertAlign w:val="subscript"/>
+        </w:rPr>
+        <w:t xml:space="preserve">2</w:t>
+      </w:r>
+      <w:r>
+        <w:rPr>
+          <w:rFonts w:ascii="Times New Roman" w:hAnsi="Times New Roman" w:cs="Times New Roman"/>
+          <w:lang w:val="tr-TR"/>
+        </w:rPr>
+        <w:t xml:space="preserve">SO</w:t>
+      </w:r>
+      <w:r>
+        <w:rPr>
+          <w:rFonts w:ascii="Times New Roman" w:hAnsi="Times New Roman" w:cs="Times New Roman"/>
+          <w:lang w:val="tr-TR"/>
+          <w:vertAlign w:val="subscript"/>
+        </w:rPr>
+        <w:t xml:space="preserve">4</w:t>
+      </w:r>
+      <w:r>
+        <w:rPr>
+          <w:rFonts w:ascii="Times New Roman" w:hAnsi="Times New Roman" w:cs="Times New Roman"/>
+          <w:lang w:val="tr-TR"/>
+        </w:rPr>
+        <w:t xml:space="preserve">. CH</w:t>
+      </w:r>
+      <w:r>
+        <w:rPr>
+          <w:rFonts w:ascii="Times New Roman" w:hAnsi="Times New Roman" w:cs="Times New Roman"/>
+          <w:lang w:val="tr-TR"/>
+          <w:vertAlign w:val="subscript"/>
+        </w:rPr>
+        <w:t xml:space="preserve">3</w:t>
+      </w:r>
+      <w:r>
+        <w:rPr>
+          <w:rFonts w:ascii="Times New Roman" w:hAnsi="Times New Roman" w:cs="Times New Roman"/>
+          <w:lang w:val="tr-TR"/>
+        </w:rPr>
+        <w:t xml:space="preserve">COO</w:t>
+      </w:r>
+      <w:r>
+        <w:rPr>
+          <w:rFonts w:ascii="Times New Roman" w:hAnsi="Times New Roman" w:cs="Times New Roman"/>
+          <w:lang w:val="tr-TR"/>
+          <w:vertAlign w:val="superscript"/>
+        </w:rPr>
+        <w:t xml:space="preserve">−</w:t>
+      </w:r>
+      <w:r>
+        <w:rPr>
+          <w:rFonts w:ascii="Times New Roman" w:hAnsi="Times New Roman" w:cs="Times New Roman"/>
+          <w:lang w:val="tr-TR"/>
+        </w:rPr>
+        <w:t xml:space="preserve">: bazlığı Arrhenius teorisiyle açıklanamaz; Brønsted-Lowry bazı, eşlenik asidi CH</w:t>
+      </w:r>
+      <w:r>
+        <w:rPr>
+          <w:rFonts w:ascii="Times New Roman" w:hAnsi="Times New Roman" w:cs="Times New Roman"/>
+          <w:lang w:val="tr-TR"/>
+          <w:vertAlign w:val="subscript"/>
+        </w:rPr>
+        <w:t xml:space="preserve">3</w:t>
+      </w:r>
+      <w:r>
+        <w:rPr>
+          <w:rFonts w:ascii="Times New Roman" w:hAnsi="Times New Roman" w:cs="Times New Roman"/>
+          <w:lang w:val="tr-TR"/>
+        </w:rPr>
+        <w:t xml:space="preserve">COOH. NaOH: Arrhenius bazı; Brønsted-Lowry teorisine göre OH</w:t>
+      </w:r>
+      <w:r>
+        <w:rPr>
+          <w:rFonts w:ascii="Times New Roman" w:hAnsi="Times New Roman" w:cs="Times New Roman"/>
+          <w:lang w:val="tr-TR"/>
+          <w:vertAlign w:val="superscript"/>
+        </w:rPr>
+        <w:t xml:space="preserve">−</w:t>
+      </w:r>
+      <w:r>
+        <w:rPr>
+          <w:rFonts w:ascii="Times New Roman" w:hAnsi="Times New Roman" w:cs="Times New Roman"/>
+          <w:lang w:val="tr-TR"/>
+        </w:rPr>
+        <w:t xml:space="preserve"> iyonu proton alan bazdır, eşlenik asidi H</w:t>
+      </w:r>
+      <w:r>
+        <w:rPr>
+          <w:rFonts w:ascii="Times New Roman" w:hAnsi="Times New Roman" w:cs="Times New Roman"/>
+          <w:lang w:val="tr-TR"/>
+          <w:vertAlign w:val="subscript"/>
+        </w:rPr>
+        <w:t xml:space="preserve">2</w:t>
+      </w:r>
+      <w:r>
+        <w:rPr>
+          <w:rFonts w:ascii="Times New Roman" w:hAnsi="Times New Roman" w:cs="Times New Roman"/>
+          <w:lang w:val="tr-TR"/>
+        </w:rPr>
+        <w:t xml:space="preserve">O. (Öğrencinin kart tasarımı bu bilgileri içermelidir.)</w:t>
       </w:r>
     </w:p>
     <w:p>

</xml_diff>

<commit_message>
Sira Sizde 2.7: kart oyunu etkinligi 1. soru olarak basa alindi, diger sorular ve cevap anahtari yeniden numaralandi
</commit_message>
<xml_diff>
--- a/CevapAnahtari/Kimya11-tema-2-cevaplar.docx
+++ b/CevapAnahtari/Kimya11-tema-2-cevaplar.docx
@@ -9373,7 +9373,332 @@
           <w:rFonts w:ascii="Times New Roman" w:hAnsi="Times New Roman" w:cs="Times New Roman"/>
           <w:lang w:val="tr-TR"/>
         </w:rPr>
-        <w:t xml:space="preserve">1.</w:t>
+        <w:t xml:space="preserve">1. Örnek kart içerikleri: HCl: Arrhenius asidi ve Brønsted-Lowry asidi, eşlenik bazı Cl</w:t>
+      </w:r>
+      <w:r>
+        <w:rPr>
+          <w:rFonts w:ascii="Times New Roman" w:hAnsi="Times New Roman" w:cs="Times New Roman"/>
+          <w:lang w:val="tr-TR"/>
+          <w:vertAlign w:val="superscript"/>
+        </w:rPr>
+        <w:t xml:space="preserve">−</w:t>
+      </w:r>
+      <w:r>
+        <w:rPr>
+          <w:rFonts w:ascii="Times New Roman" w:hAnsi="Times New Roman" w:cs="Times New Roman"/>
+          <w:lang w:val="tr-TR"/>
+        </w:rPr>
+        <w:t xml:space="preserve">. NH</w:t>
+      </w:r>
+      <w:r>
+        <w:rPr>
+          <w:rFonts w:ascii="Times New Roman" w:hAnsi="Times New Roman" w:cs="Times New Roman"/>
+          <w:lang w:val="tr-TR"/>
+          <w:vertAlign w:val="subscript"/>
+        </w:rPr>
+        <w:t xml:space="preserve">3</w:t>
+      </w:r>
+      <w:r>
+        <w:rPr>
+          <w:rFonts w:ascii="Times New Roman" w:hAnsi="Times New Roman" w:cs="Times New Roman"/>
+          <w:lang w:val="tr-TR"/>
+        </w:rPr>
+        <w:t xml:space="preserve">: yapısında OH</w:t>
+      </w:r>
+      <w:r>
+        <w:rPr>
+          <w:rFonts w:ascii="Times New Roman" w:hAnsi="Times New Roman" w:cs="Times New Roman"/>
+          <w:lang w:val="tr-TR"/>
+          <w:vertAlign w:val="superscript"/>
+        </w:rPr>
+        <w:t xml:space="preserve">−</w:t>
+      </w:r>
+      <w:r>
+        <w:rPr>
+          <w:rFonts w:ascii="Times New Roman" w:hAnsi="Times New Roman" w:cs="Times New Roman"/>
+          <w:lang w:val="tr-TR"/>
+        </w:rPr>
+        <w:t xml:space="preserve"> bulunmadığından bazlığı Arrhenius teorisiyle açıklanamaz; Brønsted-Lowry bazı, eşlenik asidi NH</w:t>
+      </w:r>
+      <w:r>
+        <w:rPr>
+          <w:rFonts w:ascii="Times New Roman" w:hAnsi="Times New Roman" w:cs="Times New Roman"/>
+          <w:lang w:val="tr-TR"/>
+          <w:vertAlign w:val="subscript"/>
+        </w:rPr>
+        <w:t xml:space="preserve">4</w:t>
+      </w:r>
+      <w:r>
+        <w:rPr>
+          <w:rFonts w:ascii="Times New Roman" w:hAnsi="Times New Roman" w:cs="Times New Roman"/>
+          <w:lang w:val="tr-TR"/>
+          <w:vertAlign w:val="superscript"/>
+        </w:rPr>
+        <w:t xml:space="preserve">+</w:t>
+      </w:r>
+      <w:r>
+        <w:rPr>
+          <w:rFonts w:ascii="Times New Roman" w:hAnsi="Times New Roman" w:cs="Times New Roman"/>
+          <w:lang w:val="tr-TR"/>
+        </w:rPr>
+        <w:t xml:space="preserve">. H</w:t>
+      </w:r>
+      <w:r>
+        <w:rPr>
+          <w:rFonts w:ascii="Times New Roman" w:hAnsi="Times New Roman" w:cs="Times New Roman"/>
+          <w:lang w:val="tr-TR"/>
+          <w:vertAlign w:val="subscript"/>
+        </w:rPr>
+        <w:t xml:space="preserve">2</w:t>
+      </w:r>
+      <w:r>
+        <w:rPr>
+          <w:rFonts w:ascii="Times New Roman" w:hAnsi="Times New Roman" w:cs="Times New Roman"/>
+          <w:lang w:val="tr-TR"/>
+        </w:rPr>
+        <w:t xml:space="preserve">O: Brønsted-Lowry teorisine göre amfoter, eşlenik asidi H</w:t>
+      </w:r>
+      <w:r>
+        <w:rPr>
+          <w:rFonts w:ascii="Times New Roman" w:hAnsi="Times New Roman" w:cs="Times New Roman"/>
+          <w:lang w:val="tr-TR"/>
+          <w:vertAlign w:val="subscript"/>
+        </w:rPr>
+        <w:t xml:space="preserve">3</w:t>
+      </w:r>
+      <w:r>
+        <w:rPr>
+          <w:rFonts w:ascii="Times New Roman" w:hAnsi="Times New Roman" w:cs="Times New Roman"/>
+          <w:lang w:val="tr-TR"/>
+        </w:rPr>
+        <w:t xml:space="preserve">O</w:t>
+      </w:r>
+      <w:r>
+        <w:rPr>
+          <w:rFonts w:ascii="Times New Roman" w:hAnsi="Times New Roman" w:cs="Times New Roman"/>
+          <w:lang w:val="tr-TR"/>
+          <w:vertAlign w:val="superscript"/>
+        </w:rPr>
+        <w:t xml:space="preserve">+</w:t>
+      </w:r>
+      <w:r>
+        <w:rPr>
+          <w:rFonts w:ascii="Times New Roman" w:hAnsi="Times New Roman" w:cs="Times New Roman"/>
+          <w:lang w:val="tr-TR"/>
+        </w:rPr>
+        <w:t xml:space="preserve">, eşlenik bazı OH</w:t>
+      </w:r>
+      <w:r>
+        <w:rPr>
+          <w:rFonts w:ascii="Times New Roman" w:hAnsi="Times New Roman" w:cs="Times New Roman"/>
+          <w:lang w:val="tr-TR"/>
+          <w:vertAlign w:val="superscript"/>
+        </w:rPr>
+        <w:t xml:space="preserve">−</w:t>
+      </w:r>
+      <w:r>
+        <w:rPr>
+          <w:rFonts w:ascii="Times New Roman" w:hAnsi="Times New Roman" w:cs="Times New Roman"/>
+          <w:lang w:val="tr-TR"/>
+        </w:rPr>
+        <w:t xml:space="preserve">. HSO</w:t>
+      </w:r>
+      <w:r>
+        <w:rPr>
+          <w:rFonts w:ascii="Times New Roman" w:hAnsi="Times New Roman" w:cs="Times New Roman"/>
+          <w:lang w:val="tr-TR"/>
+          <w:vertAlign w:val="subscript"/>
+        </w:rPr>
+        <w:t xml:space="preserve">4</w:t>
+      </w:r>
+      <w:r>
+        <w:rPr>
+          <w:rFonts w:ascii="Times New Roman" w:hAnsi="Times New Roman" w:cs="Times New Roman"/>
+          <w:lang w:val="tr-TR"/>
+          <w:vertAlign w:val="superscript"/>
+        </w:rPr>
+        <w:t xml:space="preserve">−</w:t>
+      </w:r>
+      <w:r>
+        <w:rPr>
+          <w:rFonts w:ascii="Times New Roman" w:hAnsi="Times New Roman" w:cs="Times New Roman"/>
+          <w:lang w:val="tr-TR"/>
+        </w:rPr>
+        <w:t xml:space="preserve">: suda H</w:t>
+      </w:r>
+      <w:r>
+        <w:rPr>
+          <w:rFonts w:ascii="Times New Roman" w:hAnsi="Times New Roman" w:cs="Times New Roman"/>
+          <w:lang w:val="tr-TR"/>
+          <w:vertAlign w:val="subscript"/>
+        </w:rPr>
+        <w:t xml:space="preserve">3</w:t>
+      </w:r>
+      <w:r>
+        <w:rPr>
+          <w:rFonts w:ascii="Times New Roman" w:hAnsi="Times New Roman" w:cs="Times New Roman"/>
+          <w:lang w:val="tr-TR"/>
+        </w:rPr>
+        <w:t xml:space="preserve">O</w:t>
+      </w:r>
+      <w:r>
+        <w:rPr>
+          <w:rFonts w:ascii="Times New Roman" w:hAnsi="Times New Roman" w:cs="Times New Roman"/>
+          <w:lang w:val="tr-TR"/>
+          <w:vertAlign w:val="superscript"/>
+        </w:rPr>
+        <w:t xml:space="preserve">+</w:t>
+      </w:r>
+      <w:r>
+        <w:rPr>
+          <w:rFonts w:ascii="Times New Roman" w:hAnsi="Times New Roman" w:cs="Times New Roman"/>
+          <w:lang w:val="tr-TR"/>
+        </w:rPr>
+        <w:t xml:space="preserve"> oluşturduğundan Arrhenius asidi; Brønsted-Lowry teorisine göre amfoter, eşlenik bazı SO</w:t>
+      </w:r>
+      <w:r>
+        <w:rPr>
+          <w:rFonts w:ascii="Times New Roman" w:hAnsi="Times New Roman" w:cs="Times New Roman"/>
+          <w:lang w:val="tr-TR"/>
+          <w:vertAlign w:val="subscript"/>
+        </w:rPr>
+        <w:t xml:space="preserve">4</w:t>
+      </w:r>
+      <w:r>
+        <w:rPr>
+          <w:rFonts w:ascii="Times New Roman" w:hAnsi="Times New Roman" w:cs="Times New Roman"/>
+          <w:lang w:val="tr-TR"/>
+          <w:vertAlign w:val="superscript"/>
+        </w:rPr>
+        <w:t xml:space="preserve">2−</w:t>
+      </w:r>
+      <w:r>
+        <w:rPr>
+          <w:rFonts w:ascii="Times New Roman" w:hAnsi="Times New Roman" w:cs="Times New Roman"/>
+          <w:lang w:val="tr-TR"/>
+        </w:rPr>
+        <w:t xml:space="preserve">, eşlenik asidi H</w:t>
+      </w:r>
+      <w:r>
+        <w:rPr>
+          <w:rFonts w:ascii="Times New Roman" w:hAnsi="Times New Roman" w:cs="Times New Roman"/>
+          <w:lang w:val="tr-TR"/>
+          <w:vertAlign w:val="subscript"/>
+        </w:rPr>
+        <w:t xml:space="preserve">2</w:t>
+      </w:r>
+      <w:r>
+        <w:rPr>
+          <w:rFonts w:ascii="Times New Roman" w:hAnsi="Times New Roman" w:cs="Times New Roman"/>
+          <w:lang w:val="tr-TR"/>
+        </w:rPr>
+        <w:t xml:space="preserve">SO</w:t>
+      </w:r>
+      <w:r>
+        <w:rPr>
+          <w:rFonts w:ascii="Times New Roman" w:hAnsi="Times New Roman" w:cs="Times New Roman"/>
+          <w:lang w:val="tr-TR"/>
+          <w:vertAlign w:val="subscript"/>
+        </w:rPr>
+        <w:t xml:space="preserve">4</w:t>
+      </w:r>
+      <w:r>
+        <w:rPr>
+          <w:rFonts w:ascii="Times New Roman" w:hAnsi="Times New Roman" w:cs="Times New Roman"/>
+          <w:lang w:val="tr-TR"/>
+        </w:rPr>
+        <w:t xml:space="preserve">. CH</w:t>
+      </w:r>
+      <w:r>
+        <w:rPr>
+          <w:rFonts w:ascii="Times New Roman" w:hAnsi="Times New Roman" w:cs="Times New Roman"/>
+          <w:lang w:val="tr-TR"/>
+          <w:vertAlign w:val="subscript"/>
+        </w:rPr>
+        <w:t xml:space="preserve">3</w:t>
+      </w:r>
+      <w:r>
+        <w:rPr>
+          <w:rFonts w:ascii="Times New Roman" w:hAnsi="Times New Roman" w:cs="Times New Roman"/>
+          <w:lang w:val="tr-TR"/>
+        </w:rPr>
+        <w:t xml:space="preserve">COO</w:t>
+      </w:r>
+      <w:r>
+        <w:rPr>
+          <w:rFonts w:ascii="Times New Roman" w:hAnsi="Times New Roman" w:cs="Times New Roman"/>
+          <w:lang w:val="tr-TR"/>
+          <w:vertAlign w:val="superscript"/>
+        </w:rPr>
+        <w:t xml:space="preserve">−</w:t>
+      </w:r>
+      <w:r>
+        <w:rPr>
+          <w:rFonts w:ascii="Times New Roman" w:hAnsi="Times New Roman" w:cs="Times New Roman"/>
+          <w:lang w:val="tr-TR"/>
+        </w:rPr>
+        <w:t xml:space="preserve">: bazlığı Arrhenius teorisiyle açıklanamaz; Brønsted-Lowry bazı, eşlenik asidi CH</w:t>
+      </w:r>
+      <w:r>
+        <w:rPr>
+          <w:rFonts w:ascii="Times New Roman" w:hAnsi="Times New Roman" w:cs="Times New Roman"/>
+          <w:lang w:val="tr-TR"/>
+          <w:vertAlign w:val="subscript"/>
+        </w:rPr>
+        <w:t xml:space="preserve">3</w:t>
+      </w:r>
+      <w:r>
+        <w:rPr>
+          <w:rFonts w:ascii="Times New Roman" w:hAnsi="Times New Roman" w:cs="Times New Roman"/>
+          <w:lang w:val="tr-TR"/>
+        </w:rPr>
+        <w:t xml:space="preserve">COOH. NaOH: Arrhenius bazı; Brønsted-Lowry teorisine göre OH</w:t>
+      </w:r>
+      <w:r>
+        <w:rPr>
+          <w:rFonts w:ascii="Times New Roman" w:hAnsi="Times New Roman" w:cs="Times New Roman"/>
+          <w:lang w:val="tr-TR"/>
+          <w:vertAlign w:val="superscript"/>
+        </w:rPr>
+        <w:t xml:space="preserve">−</w:t>
+      </w:r>
+      <w:r>
+        <w:rPr>
+          <w:rFonts w:ascii="Times New Roman" w:hAnsi="Times New Roman" w:cs="Times New Roman"/>
+          <w:lang w:val="tr-TR"/>
+        </w:rPr>
+        <w:t xml:space="preserve"> iyonu proton alan bazdır, eşlenik asidi H</w:t>
+      </w:r>
+      <w:r>
+        <w:rPr>
+          <w:rFonts w:ascii="Times New Roman" w:hAnsi="Times New Roman" w:cs="Times New Roman"/>
+          <w:lang w:val="tr-TR"/>
+          <w:vertAlign w:val="subscript"/>
+        </w:rPr>
+        <w:t xml:space="preserve">2</w:t>
+      </w:r>
+      <w:r>
+        <w:rPr>
+          <w:rFonts w:ascii="Times New Roman" w:hAnsi="Times New Roman" w:cs="Times New Roman"/>
+          <w:lang w:val="tr-TR"/>
+        </w:rPr>
+        <w:t xml:space="preserve">O. (Öğrencinin kart tasarımı bu bilgileri içermelidir.)</w:t>
+      </w:r>
+    </w:p>
+    <w:p>
+      <w:pPr>
+        <w:jc w:val="both"/>
+        <w:rPr>
+          <w:rFonts w:ascii="Times New Roman" w:hAnsi="Times New Roman" w:cs="Times New Roman"/>
+          <w:lang w:val="tr-TR"/>
+        </w:rPr>
+      </w:pPr>
+      <w:r>
+        <w:rPr>
+          <w:rFonts w:ascii="Times New Roman" w:hAnsi="Times New Roman" w:cs="Times New Roman"/>
+          <w:lang w:val="tr-TR"/>
+        </w:rPr>
+        <w:t xml:space="preserve">2.</w:t>
       </w:r>
     </w:p>
     <w:p>
@@ -10007,7 +10332,7 @@
           <w:rFonts w:ascii="Times New Roman" w:hAnsi="Times New Roman" w:cs="Times New Roman"/>
           <w:lang w:val="tr-TR"/>
         </w:rPr>
-        <w:t xml:space="preserve">2. Cl</w:t>
+        <w:t xml:space="preserve">3. Cl</w:t>
       </w:r>
       <w:r>
         <w:rPr>
@@ -10107,7 +10432,7 @@
           <w:rFonts w:ascii="Times New Roman" w:hAnsi="Times New Roman" w:cs="Times New Roman"/>
           <w:lang w:val="tr-TR"/>
         </w:rPr>
-        <w:t xml:space="preserve">3. HF, NH</w:t>
+        <w:t xml:space="preserve">4. HF, NH</w:t>
       </w:r>
       <w:r>
         <w:rPr>
@@ -10214,7 +10539,7 @@
           <w:rFonts w:ascii="Times New Roman" w:hAnsi="Times New Roman" w:cs="Times New Roman"/>
           <w:lang w:val="tr-TR"/>
         </w:rPr>
-        <w:t xml:space="preserve">4. Monofonksiyonel: HBr, KOH, HCOOH. Polifonksiyonel: H</w:t>
+        <w:t xml:space="preserve">5. Monofonksiyonel: HBr, KOH, HCOOH. Polifonksiyonel: H</w:t>
       </w:r>
       <w:r>
         <w:rPr>
@@ -10298,7 +10623,7 @@
           <w:rFonts w:ascii="Times New Roman" w:hAnsi="Times New Roman" w:cs="Times New Roman"/>
           <w:lang w:val="tr-TR"/>
         </w:rPr>
-        <w:t xml:space="preserve">5. SO</w:t>
+        <w:t xml:space="preserve">6. SO</w:t>
       </w:r>
       <w:r>
         <w:rPr>
@@ -10472,7 +10797,7 @@
           <w:rFonts w:ascii="Times New Roman" w:hAnsi="Times New Roman" w:cs="Times New Roman"/>
           <w:lang w:val="tr-TR"/>
         </w:rPr>
-        <w:t xml:space="preserve">6. Asidik oksit: N</w:t>
+        <w:t xml:space="preserve">7. Asidik oksit: N</w:t>
       </w:r>
       <w:r>
         <w:rPr>
@@ -10533,331 +10858,6 @@
           <w:lang w:val="tr-TR"/>
         </w:rPr>
         <w:t xml:space="preserve">O, MgO; nötr oksit: CO, NO</w:t>
-      </w:r>
-    </w:p>
-    <w:p>
-      <w:pPr>
-        <w:jc w:val="both"/>
-        <w:rPr>
-          <w:rFonts w:ascii="Times New Roman" w:hAnsi="Times New Roman" w:cs="Times New Roman"/>
-          <w:lang w:val="tr-TR"/>
-        </w:rPr>
-      </w:pPr>
-      <w:r>
-        <w:rPr>
-          <w:rFonts w:ascii="Times New Roman" w:hAnsi="Times New Roman" w:cs="Times New Roman"/>
-          <w:lang w:val="tr-TR"/>
-        </w:rPr>
-        <w:t xml:space="preserve">7. Örnek kart içerikleri: HCl: Arrhenius asidi ve Brønsted-Lowry asidi, eşlenik bazı Cl</w:t>
-      </w:r>
-      <w:r>
-        <w:rPr>
-          <w:rFonts w:ascii="Times New Roman" w:hAnsi="Times New Roman" w:cs="Times New Roman"/>
-          <w:lang w:val="tr-TR"/>
-          <w:vertAlign w:val="superscript"/>
-        </w:rPr>
-        <w:t xml:space="preserve">−</w:t>
-      </w:r>
-      <w:r>
-        <w:rPr>
-          <w:rFonts w:ascii="Times New Roman" w:hAnsi="Times New Roman" w:cs="Times New Roman"/>
-          <w:lang w:val="tr-TR"/>
-        </w:rPr>
-        <w:t xml:space="preserve">. NH</w:t>
-      </w:r>
-      <w:r>
-        <w:rPr>
-          <w:rFonts w:ascii="Times New Roman" w:hAnsi="Times New Roman" w:cs="Times New Roman"/>
-          <w:lang w:val="tr-TR"/>
-          <w:vertAlign w:val="subscript"/>
-        </w:rPr>
-        <w:t xml:space="preserve">3</w:t>
-      </w:r>
-      <w:r>
-        <w:rPr>
-          <w:rFonts w:ascii="Times New Roman" w:hAnsi="Times New Roman" w:cs="Times New Roman"/>
-          <w:lang w:val="tr-TR"/>
-        </w:rPr>
-        <w:t xml:space="preserve">: yapısında OH</w:t>
-      </w:r>
-      <w:r>
-        <w:rPr>
-          <w:rFonts w:ascii="Times New Roman" w:hAnsi="Times New Roman" w:cs="Times New Roman"/>
-          <w:lang w:val="tr-TR"/>
-          <w:vertAlign w:val="superscript"/>
-        </w:rPr>
-        <w:t xml:space="preserve">−</w:t>
-      </w:r>
-      <w:r>
-        <w:rPr>
-          <w:rFonts w:ascii="Times New Roman" w:hAnsi="Times New Roman" w:cs="Times New Roman"/>
-          <w:lang w:val="tr-TR"/>
-        </w:rPr>
-        <w:t xml:space="preserve"> bulunmadığından bazlığı Arrhenius teorisiyle açıklanamaz; Brønsted-Lowry bazı, eşlenik asidi NH</w:t>
-      </w:r>
-      <w:r>
-        <w:rPr>
-          <w:rFonts w:ascii="Times New Roman" w:hAnsi="Times New Roman" w:cs="Times New Roman"/>
-          <w:lang w:val="tr-TR"/>
-          <w:vertAlign w:val="subscript"/>
-        </w:rPr>
-        <w:t xml:space="preserve">4</w:t>
-      </w:r>
-      <w:r>
-        <w:rPr>
-          <w:rFonts w:ascii="Times New Roman" w:hAnsi="Times New Roman" w:cs="Times New Roman"/>
-          <w:lang w:val="tr-TR"/>
-          <w:vertAlign w:val="superscript"/>
-        </w:rPr>
-        <w:t xml:space="preserve">+</w:t>
-      </w:r>
-      <w:r>
-        <w:rPr>
-          <w:rFonts w:ascii="Times New Roman" w:hAnsi="Times New Roman" w:cs="Times New Roman"/>
-          <w:lang w:val="tr-TR"/>
-        </w:rPr>
-        <w:t xml:space="preserve">. H</w:t>
-      </w:r>
-      <w:r>
-        <w:rPr>
-          <w:rFonts w:ascii="Times New Roman" w:hAnsi="Times New Roman" w:cs="Times New Roman"/>
-          <w:lang w:val="tr-TR"/>
-          <w:vertAlign w:val="subscript"/>
-        </w:rPr>
-        <w:t xml:space="preserve">2</w:t>
-      </w:r>
-      <w:r>
-        <w:rPr>
-          <w:rFonts w:ascii="Times New Roman" w:hAnsi="Times New Roman" w:cs="Times New Roman"/>
-          <w:lang w:val="tr-TR"/>
-        </w:rPr>
-        <w:t xml:space="preserve">O: Brønsted-Lowry teorisine göre amfoter, eşlenik asidi H</w:t>
-      </w:r>
-      <w:r>
-        <w:rPr>
-          <w:rFonts w:ascii="Times New Roman" w:hAnsi="Times New Roman" w:cs="Times New Roman"/>
-          <w:lang w:val="tr-TR"/>
-          <w:vertAlign w:val="subscript"/>
-        </w:rPr>
-        <w:t xml:space="preserve">3</w:t>
-      </w:r>
-      <w:r>
-        <w:rPr>
-          <w:rFonts w:ascii="Times New Roman" w:hAnsi="Times New Roman" w:cs="Times New Roman"/>
-          <w:lang w:val="tr-TR"/>
-        </w:rPr>
-        <w:t xml:space="preserve">O</w:t>
-      </w:r>
-      <w:r>
-        <w:rPr>
-          <w:rFonts w:ascii="Times New Roman" w:hAnsi="Times New Roman" w:cs="Times New Roman"/>
-          <w:lang w:val="tr-TR"/>
-          <w:vertAlign w:val="superscript"/>
-        </w:rPr>
-        <w:t xml:space="preserve">+</w:t>
-      </w:r>
-      <w:r>
-        <w:rPr>
-          <w:rFonts w:ascii="Times New Roman" w:hAnsi="Times New Roman" w:cs="Times New Roman"/>
-          <w:lang w:val="tr-TR"/>
-        </w:rPr>
-        <w:t xml:space="preserve">, eşlenik bazı OH</w:t>
-      </w:r>
-      <w:r>
-        <w:rPr>
-          <w:rFonts w:ascii="Times New Roman" w:hAnsi="Times New Roman" w:cs="Times New Roman"/>
-          <w:lang w:val="tr-TR"/>
-          <w:vertAlign w:val="superscript"/>
-        </w:rPr>
-        <w:t xml:space="preserve">−</w:t>
-      </w:r>
-      <w:r>
-        <w:rPr>
-          <w:rFonts w:ascii="Times New Roman" w:hAnsi="Times New Roman" w:cs="Times New Roman"/>
-          <w:lang w:val="tr-TR"/>
-        </w:rPr>
-        <w:t xml:space="preserve">. HSO</w:t>
-      </w:r>
-      <w:r>
-        <w:rPr>
-          <w:rFonts w:ascii="Times New Roman" w:hAnsi="Times New Roman" w:cs="Times New Roman"/>
-          <w:lang w:val="tr-TR"/>
-          <w:vertAlign w:val="subscript"/>
-        </w:rPr>
-        <w:t xml:space="preserve">4</w:t>
-      </w:r>
-      <w:r>
-        <w:rPr>
-          <w:rFonts w:ascii="Times New Roman" w:hAnsi="Times New Roman" w:cs="Times New Roman"/>
-          <w:lang w:val="tr-TR"/>
-          <w:vertAlign w:val="superscript"/>
-        </w:rPr>
-        <w:t xml:space="preserve">−</w:t>
-      </w:r>
-      <w:r>
-        <w:rPr>
-          <w:rFonts w:ascii="Times New Roman" w:hAnsi="Times New Roman" w:cs="Times New Roman"/>
-          <w:lang w:val="tr-TR"/>
-        </w:rPr>
-        <w:t xml:space="preserve">: suda H</w:t>
-      </w:r>
-      <w:r>
-        <w:rPr>
-          <w:rFonts w:ascii="Times New Roman" w:hAnsi="Times New Roman" w:cs="Times New Roman"/>
-          <w:lang w:val="tr-TR"/>
-          <w:vertAlign w:val="subscript"/>
-        </w:rPr>
-        <w:t xml:space="preserve">3</w:t>
-      </w:r>
-      <w:r>
-        <w:rPr>
-          <w:rFonts w:ascii="Times New Roman" w:hAnsi="Times New Roman" w:cs="Times New Roman"/>
-          <w:lang w:val="tr-TR"/>
-        </w:rPr>
-        <w:t xml:space="preserve">O</w:t>
-      </w:r>
-      <w:r>
-        <w:rPr>
-          <w:rFonts w:ascii="Times New Roman" w:hAnsi="Times New Roman" w:cs="Times New Roman"/>
-          <w:lang w:val="tr-TR"/>
-          <w:vertAlign w:val="superscript"/>
-        </w:rPr>
-        <w:t xml:space="preserve">+</w:t>
-      </w:r>
-      <w:r>
-        <w:rPr>
-          <w:rFonts w:ascii="Times New Roman" w:hAnsi="Times New Roman" w:cs="Times New Roman"/>
-          <w:lang w:val="tr-TR"/>
-        </w:rPr>
-        <w:t xml:space="preserve"> oluşturduğundan Arrhenius asidi; Brønsted-Lowry teorisine göre amfoter, eşlenik bazı SO</w:t>
-      </w:r>
-      <w:r>
-        <w:rPr>
-          <w:rFonts w:ascii="Times New Roman" w:hAnsi="Times New Roman" w:cs="Times New Roman"/>
-          <w:lang w:val="tr-TR"/>
-          <w:vertAlign w:val="subscript"/>
-        </w:rPr>
-        <w:t xml:space="preserve">4</w:t>
-      </w:r>
-      <w:r>
-        <w:rPr>
-          <w:rFonts w:ascii="Times New Roman" w:hAnsi="Times New Roman" w:cs="Times New Roman"/>
-          <w:lang w:val="tr-TR"/>
-          <w:vertAlign w:val="superscript"/>
-        </w:rPr>
-        <w:t xml:space="preserve">2−</w:t>
-      </w:r>
-      <w:r>
-        <w:rPr>
-          <w:rFonts w:ascii="Times New Roman" w:hAnsi="Times New Roman" w:cs="Times New Roman"/>
-          <w:lang w:val="tr-TR"/>
-        </w:rPr>
-        <w:t xml:space="preserve">, eşlenik asidi H</w:t>
-      </w:r>
-      <w:r>
-        <w:rPr>
-          <w:rFonts w:ascii="Times New Roman" w:hAnsi="Times New Roman" w:cs="Times New Roman"/>
-          <w:lang w:val="tr-TR"/>
-          <w:vertAlign w:val="subscript"/>
-        </w:rPr>
-        <w:t xml:space="preserve">2</w:t>
-      </w:r>
-      <w:r>
-        <w:rPr>
-          <w:rFonts w:ascii="Times New Roman" w:hAnsi="Times New Roman" w:cs="Times New Roman"/>
-          <w:lang w:val="tr-TR"/>
-        </w:rPr>
-        <w:t xml:space="preserve">SO</w:t>
-      </w:r>
-      <w:r>
-        <w:rPr>
-          <w:rFonts w:ascii="Times New Roman" w:hAnsi="Times New Roman" w:cs="Times New Roman"/>
-          <w:lang w:val="tr-TR"/>
-          <w:vertAlign w:val="subscript"/>
-        </w:rPr>
-        <w:t xml:space="preserve">4</w:t>
-      </w:r>
-      <w:r>
-        <w:rPr>
-          <w:rFonts w:ascii="Times New Roman" w:hAnsi="Times New Roman" w:cs="Times New Roman"/>
-          <w:lang w:val="tr-TR"/>
-        </w:rPr>
-        <w:t xml:space="preserve">. CH</w:t>
-      </w:r>
-      <w:r>
-        <w:rPr>
-          <w:rFonts w:ascii="Times New Roman" w:hAnsi="Times New Roman" w:cs="Times New Roman"/>
-          <w:lang w:val="tr-TR"/>
-          <w:vertAlign w:val="subscript"/>
-        </w:rPr>
-        <w:t xml:space="preserve">3</w:t>
-      </w:r>
-      <w:r>
-        <w:rPr>
-          <w:rFonts w:ascii="Times New Roman" w:hAnsi="Times New Roman" w:cs="Times New Roman"/>
-          <w:lang w:val="tr-TR"/>
-        </w:rPr>
-        <w:t xml:space="preserve">COO</w:t>
-      </w:r>
-      <w:r>
-        <w:rPr>
-          <w:rFonts w:ascii="Times New Roman" w:hAnsi="Times New Roman" w:cs="Times New Roman"/>
-          <w:lang w:val="tr-TR"/>
-          <w:vertAlign w:val="superscript"/>
-        </w:rPr>
-        <w:t xml:space="preserve">−</w:t>
-      </w:r>
-      <w:r>
-        <w:rPr>
-          <w:rFonts w:ascii="Times New Roman" w:hAnsi="Times New Roman" w:cs="Times New Roman"/>
-          <w:lang w:val="tr-TR"/>
-        </w:rPr>
-        <w:t xml:space="preserve">: bazlığı Arrhenius teorisiyle açıklanamaz; Brønsted-Lowry bazı, eşlenik asidi CH</w:t>
-      </w:r>
-      <w:r>
-        <w:rPr>
-          <w:rFonts w:ascii="Times New Roman" w:hAnsi="Times New Roman" w:cs="Times New Roman"/>
-          <w:lang w:val="tr-TR"/>
-          <w:vertAlign w:val="subscript"/>
-        </w:rPr>
-        <w:t xml:space="preserve">3</w:t>
-      </w:r>
-      <w:r>
-        <w:rPr>
-          <w:rFonts w:ascii="Times New Roman" w:hAnsi="Times New Roman" w:cs="Times New Roman"/>
-          <w:lang w:val="tr-TR"/>
-        </w:rPr>
-        <w:t xml:space="preserve">COOH. NaOH: Arrhenius bazı; Brønsted-Lowry teorisine göre OH</w:t>
-      </w:r>
-      <w:r>
-        <w:rPr>
-          <w:rFonts w:ascii="Times New Roman" w:hAnsi="Times New Roman" w:cs="Times New Roman"/>
-          <w:lang w:val="tr-TR"/>
-          <w:vertAlign w:val="superscript"/>
-        </w:rPr>
-        <w:t xml:space="preserve">−</w:t>
-      </w:r>
-      <w:r>
-        <w:rPr>
-          <w:rFonts w:ascii="Times New Roman" w:hAnsi="Times New Roman" w:cs="Times New Roman"/>
-          <w:lang w:val="tr-TR"/>
-        </w:rPr>
-        <w:t xml:space="preserve"> iyonu proton alan bazdır, eşlenik asidi H</w:t>
-      </w:r>
-      <w:r>
-        <w:rPr>
-          <w:rFonts w:ascii="Times New Roman" w:hAnsi="Times New Roman" w:cs="Times New Roman"/>
-          <w:lang w:val="tr-TR"/>
-          <w:vertAlign w:val="subscript"/>
-        </w:rPr>
-        <w:t xml:space="preserve">2</w:t>
-      </w:r>
-      <w:r>
-        <w:rPr>
-          <w:rFonts w:ascii="Times New Roman" w:hAnsi="Times New Roman" w:cs="Times New Roman"/>
-          <w:lang w:val="tr-TR"/>
-        </w:rPr>
-        <w:t xml:space="preserve">O. (Öğrencinin kart tasarımı bu bilgileri içermelidir.)</w:t>
       </w:r>
     </w:p>
     <w:p>

</xml_diff>